<commit_message>
feat: implement DCR dynamic template system
</commit_message>
<xml_diff>
--- a/templates/F-QMS-001 _template.docx
+++ b/templates/F-QMS-001 _template.docx
@@ -24,12 +24,6 @@
         <w:gridCol w:w="3404"/>
       </w:tblGrid>
       <w:tr>
-        <w:tblPrEx>
-          <w:tblCellMar>
-            <w:top w:w="0" w:type="dxa"/>
-            <w:bottom w:w="0" w:type="dxa"/>
-          </w:tblCellMar>
-        </w:tblPrEx>
         <w:trPr>
           <w:trHeight w:val="712"/>
         </w:trPr>
@@ -60,6 +54,9 @@
                     <w:txbxContent>
                       <w:p>
                         <w:r>
+                          <w:rPr>
+                            <w:b/>
+                          </w:rPr>
                           <w:pict w14:anchorId="0CF52C12">
                             <v:shapetype id="_x0000_t75" coordsize="21600,21600" o:spt="75" o:preferrelative="t" path="m@4@5l@4@11@9@11@9@5xe" filled="f" stroked="f">
                               <v:stroke joinstyle="miter"/>
@@ -80,7 +77,7 @@
                               <v:path o:extrusionok="f" gradientshapeok="t" o:connecttype="rect"/>
                               <o:lock v:ext="edit" aspectratio="t"/>
                             </v:shapetype>
-                            <v:shape id="_x0000_i1025" type="#_x0000_t75" style="width:36pt;height:36pt">
+                            <v:shape id="_x0000_i1026" type="#_x0000_t75" style="width:36pt;height:36pt">
                               <v:imagedata r:id="rId6" o:title="LNU LOGO"/>
                             </v:shape>
                           </w:pict>
@@ -123,12 +120,6 @@
         </w:tc>
       </w:tr>
       <w:tr>
-        <w:tblPrEx>
-          <w:tblCellMar>
-            <w:top w:w="0" w:type="dxa"/>
-            <w:bottom w:w="0" w:type="dxa"/>
-          </w:tblCellMar>
-        </w:tblPrEx>
         <w:trPr>
           <w:trHeight w:val="1555"/>
         </w:trPr>
@@ -309,23 +300,7 @@
                 <w:sz w:val="22"/>
                 <w:szCs w:val="18"/>
               </w:rPr>
-              <w:t>${</w:t>
-            </w:r>
-            <w:proofErr w:type="spellStart"/>
-            <w:r>
-              <w:rPr>
-                <w:sz w:val="22"/>
-                <w:szCs w:val="18"/>
-              </w:rPr>
-              <w:t>toFor</w:t>
-            </w:r>
-            <w:proofErr w:type="spellEnd"/>
-            <w:r>
-              <w:rPr>
-                <w:sz w:val="22"/>
-                <w:szCs w:val="18"/>
-              </w:rPr>
-              <w:t>}</w:t>
+              <w:t>${toFor}</w:t>
             </w:r>
           </w:p>
           <w:p>
@@ -415,12 +390,6 @@
         </w:tc>
       </w:tr>
       <w:tr>
-        <w:tblPrEx>
-          <w:tblCellMar>
-            <w:top w:w="0" w:type="dxa"/>
-            <w:bottom w:w="0" w:type="dxa"/>
-          </w:tblCellMar>
-        </w:tblPrEx>
         <w:trPr>
           <w:trHeight w:val="519"/>
         </w:trPr>
@@ -550,15 +519,7 @@
               <w:t>New document  [</w:t>
             </w:r>
             <w:r>
-              <w:t>${</w:t>
-            </w:r>
-            <w:proofErr w:type="spellStart"/>
-            <w:r>
-              <w:t>newDoc</w:t>
-            </w:r>
-            <w:proofErr w:type="spellEnd"/>
-            <w:r>
-              <w:t xml:space="preserve">} </w:t>
+              <w:t xml:space="preserve">${newDoc} </w:t>
             </w:r>
             <w:r>
               <w:rPr>
@@ -599,15 +560,7 @@
               <w:t>Delete document  [</w:t>
             </w:r>
             <w:r>
-              <w:t>${</w:t>
-            </w:r>
-            <w:proofErr w:type="spellStart"/>
-            <w:r>
-              <w:t>deleteDoc</w:t>
-            </w:r>
-            <w:proofErr w:type="spellEnd"/>
-            <w:r>
-              <w:t xml:space="preserve">} </w:t>
+              <w:t xml:space="preserve">${deleteDoc} </w:t>
             </w:r>
             <w:r>
               <w:rPr>
@@ -620,12 +573,6 @@
         </w:tc>
       </w:tr>
       <w:tr>
-        <w:tblPrEx>
-          <w:tblCellMar>
-            <w:top w:w="0" w:type="dxa"/>
-            <w:bottom w:w="0" w:type="dxa"/>
-          </w:tblCellMar>
-        </w:tblPrEx>
         <w:trPr>
           <w:trHeight w:val="230"/>
         </w:trPr>
@@ -746,12 +693,6 @@
         </w:tc>
       </w:tr>
       <w:tr>
-        <w:tblPrEx>
-          <w:tblCellMar>
-            <w:top w:w="0" w:type="dxa"/>
-            <w:bottom w:w="0" w:type="dxa"/>
-          </w:tblCellMar>
-        </w:tblPrEx>
         <w:trPr>
           <w:trHeight w:val="2140"/>
         </w:trPr>
@@ -860,25 +801,7 @@
                 <w:sz w:val="22"/>
                 <w:szCs w:val="22"/>
               </w:rPr>
-              <w:t>${</w:t>
-            </w:r>
-            <w:proofErr w:type="spellStart"/>
-            <w:r>
-              <w:rPr>
-                <w:rFonts w:ascii="Arial" w:hAnsi="Arial" w:cs="Arial"/>
-                <w:sz w:val="22"/>
-                <w:szCs w:val="22"/>
-              </w:rPr>
-              <w:t>documentNumber</w:t>
-            </w:r>
-            <w:proofErr w:type="spellEnd"/>
-            <w:r>
-              <w:rPr>
-                <w:rFonts w:ascii="Arial" w:hAnsi="Arial" w:cs="Arial"/>
-                <w:sz w:val="22"/>
-                <w:szCs w:val="22"/>
-              </w:rPr>
-              <w:t>}</w:t>
+              <w:t>${documentNumber}</w:t>
             </w:r>
           </w:p>
           <w:p>
@@ -929,23 +852,7 @@
                 <w:sz w:val="22"/>
                 <w:szCs w:val="18"/>
               </w:rPr>
-              <w:t>${</w:t>
-            </w:r>
-            <w:proofErr w:type="spellStart"/>
-            <w:r>
-              <w:rPr>
-                <w:sz w:val="22"/>
-                <w:szCs w:val="18"/>
-              </w:rPr>
-              <w:t>documentTitle</w:t>
-            </w:r>
-            <w:proofErr w:type="spellEnd"/>
-            <w:r>
-              <w:rPr>
-                <w:sz w:val="22"/>
-                <w:szCs w:val="18"/>
-              </w:rPr>
-              <w:t>}</w:t>
+              <w:t>${documentTitle}</w:t>
             </w:r>
           </w:p>
           <w:p>
@@ -1002,25 +909,7 @@
                 <w:sz w:val="22"/>
                 <w:szCs w:val="22"/>
               </w:rPr>
-              <w:t>${</w:t>
-            </w:r>
-            <w:proofErr w:type="spellStart"/>
-            <w:r>
-              <w:rPr>
-                <w:rFonts w:ascii="Arial" w:hAnsi="Arial" w:cs="Arial"/>
-                <w:sz w:val="22"/>
-                <w:szCs w:val="22"/>
-              </w:rPr>
-              <w:t>revisionStatus</w:t>
-            </w:r>
-            <w:proofErr w:type="spellEnd"/>
-            <w:r>
-              <w:rPr>
-                <w:rFonts w:ascii="Arial" w:hAnsi="Arial" w:cs="Arial"/>
-                <w:sz w:val="22"/>
-                <w:szCs w:val="22"/>
-              </w:rPr>
-              <w:t>}</w:t>
+              <w:t>${revisionStatus}</w:t>
             </w:r>
           </w:p>
           <w:p>
@@ -1045,12 +934,6 @@
         </w:tc>
       </w:tr>
       <w:tr>
-        <w:tblPrEx>
-          <w:tblCellMar>
-            <w:top w:w="0" w:type="dxa"/>
-            <w:bottom w:w="0" w:type="dxa"/>
-          </w:tblCellMar>
-        </w:tblPrEx>
         <w:trPr>
           <w:trHeight w:val="3841"/>
         </w:trPr>
@@ -1108,15 +991,7 @@
               </w:rPr>
             </w:pPr>
             <w:r>
-              <w:t>${</w:t>
-            </w:r>
-            <w:proofErr w:type="spellStart"/>
-            <w:r>
-              <w:t>changesRequested</w:t>
-            </w:r>
-            <w:proofErr w:type="spellEnd"/>
-            <w:r>
-              <w:t>}</w:t>
+              <w:t>${changesRequested}</w:t>
             </w:r>
           </w:p>
           <w:p>
@@ -1326,15 +1201,7 @@
                     </w:rPr>
                   </w:pPr>
                   <w:r>
-                    <w:t>${</w:t>
-                  </w:r>
-                  <w:proofErr w:type="spellStart"/>
-                  <w:r>
-                    <w:t>requestedBy</w:t>
-                  </w:r>
-                  <w:proofErr w:type="spellEnd"/>
-                  <w:r>
-                    <w:t>}</w:t>
+                    <w:t>${requestedBy}</w:t>
                   </w:r>
                 </w:p>
               </w:tc>
@@ -1388,15 +1255,7 @@
                     </w:rPr>
                   </w:pPr>
                   <w:r>
-                    <w:t>${</w:t>
-                  </w:r>
-                  <w:proofErr w:type="spellStart"/>
-                  <w:r>
-                    <w:t>deptUnitHead</w:t>
-                  </w:r>
-                  <w:proofErr w:type="spellEnd"/>
-                  <w:r>
-                    <w:t>}</w:t>
+                    <w:t>${deptUnitHead}</w:t>
                   </w:r>
                 </w:p>
               </w:tc>
@@ -1527,12 +1386,6 @@
         </w:tc>
       </w:tr>
       <w:tr>
-        <w:tblPrEx>
-          <w:tblCellMar>
-            <w:top w:w="0" w:type="dxa"/>
-            <w:bottom w:w="0" w:type="dxa"/>
-          </w:tblCellMar>
-        </w:tblPrEx>
         <w:trPr>
           <w:trHeight w:val="1681"/>
         </w:trPr>
@@ -1694,25 +1547,7 @@
                       <w:sz w:val="22"/>
                       <w:szCs w:val="22"/>
                     </w:rPr>
-                    <w:t>[${</w:t>
-                  </w:r>
-                  <w:proofErr w:type="spellStart"/>
-                  <w:r>
-                    <w:rPr>
-                      <w:rFonts w:ascii="Arial" w:hAnsi="Arial" w:cs="Arial"/>
-                      <w:sz w:val="22"/>
-                      <w:szCs w:val="22"/>
-                    </w:rPr>
-                    <w:t>requestDenied</w:t>
-                  </w:r>
-                  <w:proofErr w:type="spellEnd"/>
-                  <w:r>
-                    <w:rPr>
-                      <w:rFonts w:ascii="Arial" w:hAnsi="Arial" w:cs="Arial"/>
-                      <w:sz w:val="22"/>
-                      <w:szCs w:val="22"/>
-                    </w:rPr>
-                    <w:t>}</w:t>
+                    <w:t>[${requestDenied}</w:t>
                   </w:r>
                   <w:r>
                     <w:rPr>
@@ -1758,25 +1593,7 @@
                       <w:sz w:val="22"/>
                       <w:szCs w:val="22"/>
                     </w:rPr>
-                    <w:t>[${</w:t>
-                  </w:r>
-                  <w:proofErr w:type="spellStart"/>
-                  <w:r>
-                    <w:rPr>
-                      <w:rFonts w:ascii="Arial" w:hAnsi="Arial" w:cs="Arial"/>
-                      <w:sz w:val="22"/>
-                      <w:szCs w:val="22"/>
-                    </w:rPr>
-                    <w:t>requestAccepted</w:t>
-                  </w:r>
-                  <w:proofErr w:type="spellEnd"/>
-                  <w:r>
-                    <w:rPr>
-                      <w:rFonts w:ascii="Arial" w:hAnsi="Arial" w:cs="Arial"/>
-                      <w:sz w:val="22"/>
-                      <w:szCs w:val="22"/>
-                    </w:rPr>
-                    <w:t>}</w:t>
+                    <w:t>[${requestAccepted}</w:t>
                   </w:r>
                   <w:r>
                     <w:t xml:space="preserve"> </w:t>
@@ -1814,13 +1631,8 @@
                     </w:rPr>
                   </w:pPr>
                   <w:r>
-                    <w:t>${</w:t>
+                    <w:t>${imrSigDate</w:t>
                   </w:r>
-                  <w:proofErr w:type="spellStart"/>
-                  <w:r>
-                    <w:t>imrSigDate</w:t>
-                  </w:r>
-                  <w:proofErr w:type="spellEnd"/>
                   <w:r>
                     <w:t>}</w:t>
                   </w:r>
@@ -1924,12 +1736,6 @@
         </w:tc>
       </w:tr>
       <w:tr>
-        <w:tblPrEx>
-          <w:tblCellMar>
-            <w:top w:w="0" w:type="dxa"/>
-            <w:bottom w:w="0" w:type="dxa"/>
-          </w:tblCellMar>
-        </w:tblPrEx>
         <w:trPr>
           <w:trHeight w:val="1501"/>
         </w:trPr>
@@ -2044,15 +1850,7 @@
                     <w:jc w:val="center"/>
                   </w:pPr>
                   <w:r>
-                    <w:t>${</w:t>
-                  </w:r>
-                  <w:proofErr w:type="spellStart"/>
-                  <w:r>
-                    <w:t>approvingSigName</w:t>
-                  </w:r>
-                  <w:proofErr w:type="spellEnd"/>
-                  <w:r>
-                    <w:t>}</w:t>
+                    <w:t>${approvingSigName}</w:t>
                   </w:r>
                 </w:p>
               </w:tc>
@@ -2092,15 +1890,7 @@
                     <w:jc w:val="center"/>
                   </w:pPr>
                   <w:r>
-                    <w:t>${</w:t>
-                  </w:r>
-                  <w:proofErr w:type="spellStart"/>
-                  <w:r>
-                    <w:t>approvingDate</w:t>
-                  </w:r>
-                  <w:proofErr w:type="spellEnd"/>
-                  <w:r>
-                    <w:t>}</w:t>
+                    <w:t>${approvingDate}</w:t>
                   </w:r>
                 </w:p>
               </w:tc>
@@ -2193,12 +1983,6 @@
         </w:tc>
       </w:tr>
       <w:tr>
-        <w:tblPrEx>
-          <w:tblCellMar>
-            <w:top w:w="0" w:type="dxa"/>
-            <w:bottom w:w="0" w:type="dxa"/>
-          </w:tblCellMar>
-        </w:tblPrEx>
         <w:trPr>
           <w:trHeight w:val="2491"/>
         </w:trPr>
@@ -2365,15 +2149,7 @@
                     </w:rPr>
                   </w:pPr>
                   <w:r>
-                    <w:t>${</w:t>
-                  </w:r>
-                  <w:proofErr w:type="spellStart"/>
-                  <w:r>
-                    <w:t>statusNo</w:t>
-                  </w:r>
-                  <w:proofErr w:type="spellEnd"/>
-                  <w:r>
-                    <w:t>}</w:t>
+                    <w:t>${statusNo}</w:t>
                   </w:r>
                 </w:p>
               </w:tc>
@@ -2432,15 +2208,7 @@
                     </w:rPr>
                   </w:pPr>
                   <w:r>
-                    <w:t>${</w:t>
-                  </w:r>
-                  <w:proofErr w:type="spellStart"/>
-                  <w:r>
-                    <w:t>statusVersion</w:t>
-                  </w:r>
-                  <w:proofErr w:type="spellEnd"/>
-                  <w:r>
-                    <w:t>}</w:t>
+                    <w:t>${statusVersion}</w:t>
                   </w:r>
                 </w:p>
               </w:tc>
@@ -2499,15 +2267,7 @@
                     </w:rPr>
                   </w:pPr>
                   <w:r>
-                    <w:t>${</w:t>
-                  </w:r>
-                  <w:proofErr w:type="spellStart"/>
-                  <w:r>
-                    <w:t>statusRevision</w:t>
-                  </w:r>
-                  <w:proofErr w:type="spellEnd"/>
-                  <w:r>
-                    <w:t>}</w:t>
+                    <w:t>${statusRevision}</w:t>
                   </w:r>
                 </w:p>
               </w:tc>
@@ -2568,15 +2328,7 @@
                     </w:rPr>
                   </w:pPr>
                   <w:r>
-                    <w:t>${</w:t>
-                  </w:r>
-                  <w:proofErr w:type="spellStart"/>
-                  <w:r>
-                    <w:t>effectivityDate</w:t>
-                  </w:r>
-                  <w:proofErr w:type="spellEnd"/>
-                  <w:r>
-                    <w:t>}</w:t>
+                    <w:t>${effectivityDate}</w:t>
                   </w:r>
                 </w:p>
               </w:tc>
@@ -2601,7 +2353,7 @@
                 <w:noProof/>
               </w:rPr>
               <w:pict w14:anchorId="13E363EB">
-                <v:shape id="_x0000_s2056" type="#_x0000_t202" style="position:absolute;margin-left:195.3pt;margin-top:0;width:209.3pt;height:32.5pt;z-index:3;visibility:visible;mso-width-percent:400;mso-height-percent:200;mso-wrap-distance-top:3.6pt;mso-wrap-distance-bottom:3.6pt;mso-position-horizontal:right;mso-position-horizontal-relative:margin;mso-position-vertical:bottom;mso-position-vertical-relative:margin;mso-width-percent:400;mso-height-percent:200;mso-width-relative:margin;mso-height-relative:margin" filled="f" stroked="f">
+                <v:shape id="_x0000_s2056" type="#_x0000_t202" style="position:absolute;margin-left:353.4pt;margin-top:0;width:209.3pt;height:32.5pt;z-index:3;visibility:visible;mso-width-percent:400;mso-height-percent:200;mso-wrap-distance-top:3.6pt;mso-wrap-distance-bottom:3.6pt;mso-position-horizontal:right;mso-position-horizontal-relative:margin;mso-position-vertical:bottom;mso-position-vertical-relative:margin;mso-width-percent:400;mso-height-percent:200;mso-width-relative:margin;mso-height-relative:margin" filled="f" stroked="f">
                   <v:textbox style="mso-next-textbox:#_x0000_s2056;mso-fit-shape-to-text:t">
                     <w:txbxContent>
                       <w:p>
@@ -2638,25 +2390,7 @@
                             <w:sz w:val="22"/>
                             <w:szCs w:val="22"/>
                           </w:rPr>
-                          <w:t>${</w:t>
-                        </w:r>
-                        <w:proofErr w:type="spellStart"/>
-                        <w:r>
-                          <w:rPr>
-                            <w:rFonts w:ascii="Arial" w:hAnsi="Arial" w:cs="Arial"/>
-                            <w:sz w:val="22"/>
-                            <w:szCs w:val="22"/>
-                          </w:rPr>
-                          <w:t>idsDateUpdated</w:t>
-                        </w:r>
-                        <w:proofErr w:type="spellEnd"/>
-                        <w:r>
-                          <w:rPr>
-                            <w:rFonts w:ascii="Arial" w:hAnsi="Arial" w:cs="Arial"/>
-                            <w:sz w:val="22"/>
-                            <w:szCs w:val="22"/>
-                          </w:rPr>
-                          <w:t>}</w:t>
+                          <w:t>${idsDateUpdated}</w:t>
                         </w:r>
                       </w:p>
                     </w:txbxContent>
@@ -2726,16 +2460,8 @@
               <w:rPr>
                 <w:rFonts w:ascii="Arial" w:hAnsi="Arial" w:cs="Arial"/>
               </w:rPr>
-              <w:t>${</w:t>
-            </w:r>
-            <w:proofErr w:type="spellStart"/>
-            <w:r>
-              <w:rPr>
-                <w:rFonts w:ascii="Arial" w:hAnsi="Arial" w:cs="Arial"/>
-              </w:rPr>
-              <w:t>idsDateUpdated</w:t>
-            </w:r>
-            <w:proofErr w:type="spellEnd"/>
+              <w:t>${idsDateUpdated</w:t>
+            </w:r>
             <w:r>
               <w:rPr>
                 <w:rFonts w:ascii="Arial" w:hAnsi="Arial" w:cs="Arial"/>
@@ -2794,32 +2520,12 @@
               <w:rPr>
                 <w:rFonts w:ascii="Arial" w:hAnsi="Arial" w:cs="Arial"/>
               </w:rPr>
-              <w:t>${</w:t>
-            </w:r>
-            <w:proofErr w:type="spellStart"/>
-            <w:r>
-              <w:rPr>
-                <w:rFonts w:ascii="Arial" w:hAnsi="Arial" w:cs="Arial"/>
-              </w:rPr>
-              <w:t>updatedBy</w:t>
-            </w:r>
-            <w:proofErr w:type="spellEnd"/>
-            <w:r>
-              <w:rPr>
-                <w:rFonts w:ascii="Arial" w:hAnsi="Arial" w:cs="Arial"/>
-              </w:rPr>
-              <w:t>}</w:t>
+              <w:t>${updatedBy}</w:t>
             </w:r>
           </w:p>
         </w:tc>
       </w:tr>
       <w:tr>
-        <w:tblPrEx>
-          <w:tblCellMar>
-            <w:top w:w="0" w:type="dxa"/>
-            <w:bottom w:w="0" w:type="dxa"/>
-          </w:tblCellMar>
-        </w:tblPrEx>
         <w:trPr>
           <w:trHeight w:val="307"/>
         </w:trPr>
@@ -2940,7 +2646,44 @@
         </w:tc>
       </w:tr>
     </w:tbl>
-    <w:p/>
+    <w:p>
+      <w:r>
+        <w:rPr>
+          <w:rFonts w:ascii="Arial" w:hAnsi="Arial" w:cs="Arial"/>
+        </w:rPr>
+        <w:t xml:space="preserve">OFFICE CODE: </w:t>
+      </w:r>
+      <w:r>
+        <w:rPr>
+          <w:rFonts w:ascii="Arial" w:hAnsi="Arial" w:cs="Arial"/>
+        </w:rPr>
+        <w:t>${</w:t>
+      </w:r>
+      <w:r>
+        <w:rPr>
+          <w:rFonts w:ascii="Arial" w:hAnsi="Arial" w:cs="Arial"/>
+        </w:rPr>
+        <w:t>officeCode</w:t>
+      </w:r>
+      <w:r>
+        <w:rPr>
+          <w:rFonts w:ascii="Arial" w:hAnsi="Arial" w:cs="Arial"/>
+          <w:bCs/>
+          <w:sz w:val="22"/>
+          <w:szCs w:val="22"/>
+        </w:rPr>
+        <w:t>}</w:t>
+      </w:r>
+      <w:r>
+        <w:rPr>
+          <w:rFonts w:ascii="Arial" w:hAnsi="Arial"/>
+          <w:b/>
+          <w:sz w:val="22"/>
+          <w:szCs w:val="22"/>
+        </w:rPr>
+        <w:t xml:space="preserve">           </w:t>
+      </w:r>
+    </w:p>
     <w:sectPr>
       <w:pgSz w:w="11906" w:h="16838" w:code="9"/>
       <w:pgMar w:top="288" w:right="720" w:bottom="187" w:left="720" w:header="576" w:footer="432" w:gutter="0"/>
@@ -3016,6 +2759,50 @@
     <w:lsdException w:name="Subtitle" w:qFormat="1"/>
     <w:lsdException w:name="Strong" w:qFormat="1"/>
     <w:lsdException w:name="Emphasis" w:qFormat="1"/>
+    <w:lsdException w:name="Normal Table" w:semiHidden="1" w:unhideWhenUsed="1"/>
+    <w:lsdException w:name="Table Simple 1" w:semiHidden="1" w:unhideWhenUsed="1"/>
+    <w:lsdException w:name="Table Simple 2" w:semiHidden="1" w:unhideWhenUsed="1"/>
+    <w:lsdException w:name="Table Simple 3" w:semiHidden="1" w:unhideWhenUsed="1"/>
+    <w:lsdException w:name="Table Classic 1" w:semiHidden="1" w:unhideWhenUsed="1"/>
+    <w:lsdException w:name="Table Classic 2" w:semiHidden="1" w:unhideWhenUsed="1"/>
+    <w:lsdException w:name="Table Classic 3" w:semiHidden="1" w:unhideWhenUsed="1"/>
+    <w:lsdException w:name="Table Classic 4" w:semiHidden="1" w:unhideWhenUsed="1"/>
+    <w:lsdException w:name="Table Colorful 1" w:semiHidden="1" w:unhideWhenUsed="1"/>
+    <w:lsdException w:name="Table Colorful 2" w:semiHidden="1" w:unhideWhenUsed="1"/>
+    <w:lsdException w:name="Table Colorful 3" w:semiHidden="1" w:unhideWhenUsed="1"/>
+    <w:lsdException w:name="Table Columns 1" w:semiHidden="1" w:unhideWhenUsed="1"/>
+    <w:lsdException w:name="Table Columns 2" w:semiHidden="1" w:unhideWhenUsed="1"/>
+    <w:lsdException w:name="Table Columns 3" w:semiHidden="1" w:unhideWhenUsed="1"/>
+    <w:lsdException w:name="Table Columns 4" w:semiHidden="1" w:unhideWhenUsed="1"/>
+    <w:lsdException w:name="Table Columns 5" w:semiHidden="1" w:unhideWhenUsed="1"/>
+    <w:lsdException w:name="Table Grid 1" w:semiHidden="1" w:unhideWhenUsed="1"/>
+    <w:lsdException w:name="Table Grid 2" w:semiHidden="1" w:unhideWhenUsed="1"/>
+    <w:lsdException w:name="Table Grid 3" w:semiHidden="1" w:unhideWhenUsed="1"/>
+    <w:lsdException w:name="Table Grid 4" w:semiHidden="1" w:unhideWhenUsed="1"/>
+    <w:lsdException w:name="Table Grid 5" w:semiHidden="1" w:unhideWhenUsed="1"/>
+    <w:lsdException w:name="Table Grid 6" w:semiHidden="1" w:unhideWhenUsed="1"/>
+    <w:lsdException w:name="Table Grid 7" w:semiHidden="1" w:unhideWhenUsed="1"/>
+    <w:lsdException w:name="Table Grid 8" w:semiHidden="1" w:unhideWhenUsed="1"/>
+    <w:lsdException w:name="Table List 1" w:semiHidden="1" w:unhideWhenUsed="1"/>
+    <w:lsdException w:name="Table List 2" w:semiHidden="1" w:unhideWhenUsed="1"/>
+    <w:lsdException w:name="Table List 3" w:semiHidden="1" w:unhideWhenUsed="1"/>
+    <w:lsdException w:name="Table List 4" w:semiHidden="1" w:unhideWhenUsed="1"/>
+    <w:lsdException w:name="Table List 5" w:semiHidden="1" w:unhideWhenUsed="1"/>
+    <w:lsdException w:name="Table List 6" w:semiHidden="1" w:unhideWhenUsed="1"/>
+    <w:lsdException w:name="Table List 7" w:semiHidden="1" w:unhideWhenUsed="1"/>
+    <w:lsdException w:name="Table List 8" w:semiHidden="1" w:unhideWhenUsed="1"/>
+    <w:lsdException w:name="Table 3D effects 1" w:semiHidden="1" w:unhideWhenUsed="1"/>
+    <w:lsdException w:name="Table 3D effects 2" w:semiHidden="1" w:unhideWhenUsed="1"/>
+    <w:lsdException w:name="Table 3D effects 3" w:semiHidden="1" w:unhideWhenUsed="1"/>
+    <w:lsdException w:name="Table Contemporary" w:semiHidden="1" w:unhideWhenUsed="1"/>
+    <w:lsdException w:name="Table Elegant" w:semiHidden="1" w:unhideWhenUsed="1"/>
+    <w:lsdException w:name="Table Professional" w:semiHidden="1" w:unhideWhenUsed="1"/>
+    <w:lsdException w:name="Table Subtle 1" w:semiHidden="1" w:unhideWhenUsed="1"/>
+    <w:lsdException w:name="Table Subtle 2" w:semiHidden="1" w:unhideWhenUsed="1"/>
+    <w:lsdException w:name="Table Web 1" w:semiHidden="1" w:unhideWhenUsed="1"/>
+    <w:lsdException w:name="Table Web 2" w:semiHidden="1" w:unhideWhenUsed="1"/>
+    <w:lsdException w:name="Table Web 3" w:semiHidden="1" w:unhideWhenUsed="1"/>
+    <w:lsdException w:name="Table Theme" w:semiHidden="1" w:unhideWhenUsed="1"/>
     <w:lsdException w:name="Placeholder Text" w:semiHidden="1" w:uiPriority="99" w:unhideWhenUsed="1"/>
     <w:lsdException w:name="No Spacing" w:uiPriority="99" w:qFormat="1"/>
     <w:lsdException w:name="Light Shading" w:uiPriority="99"/>
@@ -3134,8 +2921,8 @@
     <w:lsdException w:name="Plain Table 5" w:uiPriority="31" w:qFormat="1"/>
     <w:lsdException w:name="Grid Table Light" w:uiPriority="32" w:qFormat="1"/>
     <w:lsdException w:name="Grid Table 1 Light" w:uiPriority="33" w:qFormat="1"/>
-    <w:lsdException w:name="Grid Table 2" w:semiHidden="1" w:uiPriority="37" w:unhideWhenUsed="1"/>
-    <w:lsdException w:name="Grid Table 3" w:semiHidden="1" w:uiPriority="39" w:unhideWhenUsed="1" w:qFormat="1"/>
+    <w:lsdException w:name="Grid Table 2" w:uiPriority="37"/>
+    <w:lsdException w:name="Grid Table 3" w:uiPriority="39" w:qFormat="1"/>
     <w:lsdException w:name="Grid Table 4" w:uiPriority="41"/>
     <w:lsdException w:name="Grid Table 5 Dark" w:uiPriority="42"/>
     <w:lsdException w:name="Grid Table 6 Colorful" w:uiPriority="43"/>
@@ -3266,11 +3053,15 @@
   </w:style>
   <w:style w:type="character" w:default="1" w:styleId="DefaultParagraphFont">
     <w:name w:val="Default Paragraph Font"/>
+    <w:uiPriority w:val="1"/>
     <w:semiHidden/>
+    <w:unhideWhenUsed/>
   </w:style>
   <w:style w:type="table" w:default="1" w:styleId="TableNormal">
     <w:name w:val="Normal Table"/>
+    <w:uiPriority w:val="99"/>
     <w:semiHidden/>
+    <w:unhideWhenUsed/>
     <w:tblPr>
       <w:tblInd w:w="0" w:type="dxa"/>
       <w:tblCellMar>
@@ -3283,7 +3074,9 @@
   </w:style>
   <w:style w:type="numbering" w:default="1" w:styleId="NoList">
     <w:name w:val="No List"/>
+    <w:uiPriority w:val="99"/>
     <w:semiHidden/>
+    <w:unhideWhenUsed/>
   </w:style>
   <w:style w:type="paragraph" w:styleId="Title">
     <w:name w:val="Title"/>

</xml_diff>

<commit_message>
fix: add missing indexes, unique constraint, and data integrity fixes
</commit_message>
<xml_diff>
--- a/templates/F-QMS-001 _template.docx
+++ b/templates/F-QMS-001 _template.docx
@@ -54,9 +54,6 @@
                     <w:txbxContent>
                       <w:p>
                         <w:r>
-                          <w:rPr>
-                            <w:b/>
-                          </w:rPr>
                           <w:pict w14:anchorId="0CF52C12">
                             <v:shapetype id="_x0000_t75" coordsize="21600,21600" o:spt="75" o:preferrelative="t" path="m@4@5l@4@11@9@11@9@5xe" filled="f" stroked="f">
                               <v:stroke joinstyle="miter"/>
@@ -2353,7 +2350,7 @@
                 <w:noProof/>
               </w:rPr>
               <w:pict w14:anchorId="13E363EB">
-                <v:shape id="_x0000_s2056" type="#_x0000_t202" style="position:absolute;margin-left:353.4pt;margin-top:0;width:209.3pt;height:32.5pt;z-index:3;visibility:visible;mso-width-percent:400;mso-height-percent:200;mso-wrap-distance-top:3.6pt;mso-wrap-distance-bottom:3.6pt;mso-position-horizontal:right;mso-position-horizontal-relative:margin;mso-position-vertical:bottom;mso-position-vertical-relative:margin;mso-width-percent:400;mso-height-percent:200;mso-width-relative:margin;mso-height-relative:margin" filled="f" stroked="f">
+                <v:shape id="_x0000_s2056" type="#_x0000_t202" style="position:absolute;margin-left:511.5pt;margin-top:0;width:209.3pt;height:32.5pt;z-index:3;visibility:visible;mso-width-percent:400;mso-height-percent:200;mso-wrap-distance-top:3.6pt;mso-wrap-distance-bottom:3.6pt;mso-position-horizontal:right;mso-position-horizontal-relative:margin;mso-position-vertical:bottom;mso-position-vertical-relative:margin;mso-width-percent:400;mso-height-percent:200;mso-width-relative:margin;mso-height-relative:margin" filled="f" stroked="f">
                   <v:textbox style="mso-next-textbox:#_x0000_s2056;mso-fit-shape-to-text:t">
                     <w:txbxContent>
                       <w:p>
@@ -2646,44 +2643,7 @@
         </w:tc>
       </w:tr>
     </w:tbl>
-    <w:p>
-      <w:r>
-        <w:rPr>
-          <w:rFonts w:ascii="Arial" w:hAnsi="Arial" w:cs="Arial"/>
-        </w:rPr>
-        <w:t xml:space="preserve">OFFICE CODE: </w:t>
-      </w:r>
-      <w:r>
-        <w:rPr>
-          <w:rFonts w:ascii="Arial" w:hAnsi="Arial" w:cs="Arial"/>
-        </w:rPr>
-        <w:t>${</w:t>
-      </w:r>
-      <w:r>
-        <w:rPr>
-          <w:rFonts w:ascii="Arial" w:hAnsi="Arial" w:cs="Arial"/>
-        </w:rPr>
-        <w:t>officeCode</w:t>
-      </w:r>
-      <w:r>
-        <w:rPr>
-          <w:rFonts w:ascii="Arial" w:hAnsi="Arial" w:cs="Arial"/>
-          <w:bCs/>
-          <w:sz w:val="22"/>
-          <w:szCs w:val="22"/>
-        </w:rPr>
-        <w:t>}</w:t>
-      </w:r>
-      <w:r>
-        <w:rPr>
-          <w:rFonts w:ascii="Arial" w:hAnsi="Arial"/>
-          <w:b/>
-          <w:sz w:val="22"/>
-          <w:szCs w:val="22"/>
-        </w:rPr>
-        <w:t xml:space="preserve">           </w:t>
-      </w:r>
-    </w:p>
+    <w:p/>
     <w:sectPr>
       <w:pgSz w:w="11906" w:h="16838" w:code="9"/>
       <w:pgMar w:top="288" w:right="720" w:bottom="187" w:left="720" w:header="576" w:footer="432" w:gutter="0"/>

</xml_diff>